<commit_message>
deploy: 2026-07-07 05:16 (build 20260707051612)
</commit_message>
<xml_diff>
--- a/cloudflare-deploy/public/library/agency/agency-en.docx
+++ b/cloudflare-deploy/public/library/agency/agency-en.docx
@@ -6602,6 +6602,1260 @@
                     <a:xfrm>
                       <a:off x="0" y="0"/>
                       <a:ext cx="5669280" cy="1640655"/>
+                    </a:xfrm>
+                    <a:prstGeom prst="rect"/>
+                  </pic:spPr>
+                </pic:pic>
+              </a:graphicData>
+            </a:graphic>
+          </wp:inline>
+        </w:drawing>
+      </w:r>
+    </w:p>
+    <w:p>
+      <w:pPr>
+        <w:spacing w:before="240" w:after="40"/>
+      </w:pPr>
+      <w:r>
+        <w:rPr>
+          <w:rFonts w:ascii="Malgun Gothic" w:hAnsi="Malgun Gothic" w:eastAsia="Malgun Gothic"/>
+          <w:b/>
+          <w:color w:val="E11D48"/>
+          <w:sz w:val="28"/>
+        </w:rPr>
+        <w:t>17.  📢 Notice Studio (Poster + Popup)</w:t>
+      </w:r>
+    </w:p>
+    <w:p>
+      <w:pPr>
+        <w:spacing w:after="120" w:before="0"/>
+      </w:pPr>
+      <w:r>
+        <w:rPr>
+          <w:rFonts w:ascii="Malgun Gothic" w:hAnsi="Malgun Gothic" w:eastAsia="Malgun Gothic"/>
+          <w:b w:val="0"/>
+          <w:color w:val="64748B"/>
+          <w:sz w:val="21"/>
+        </w:rPr>
+        <w:t>Design notice/event posters and push them as app popups</w:t>
+      </w:r>
+    </w:p>
+    <w:tbl>
+      <w:tblPr>
+        <w:tblW w:type="auto" w:w="0"/>
+        <w:jc w:val="center"/>
+        <w:tblLook w:firstColumn="1" w:firstRow="1" w:lastColumn="0" w:lastRow="0" w:noHBand="0" w:noVBand="1" w:val="04A0"/>
+        <w:tblBorders>
+          <w:top w:val="none"/>
+          <w:left w:val="none"/>
+          <w:bottom w:val="none"/>
+          <w:right w:val="none"/>
+          <w:insideH w:val="none"/>
+          <w:insideV w:val="none"/>
+        </w:tblBorders>
+      </w:tblPr>
+      <w:tblGrid>
+        <w:gridCol w:w="9936"/>
+      </w:tblGrid>
+      <w:tr>
+        <w:tc>
+          <w:tcPr>
+            <w:tcW w:type="dxa" w:w="9216"/>
+            <w:shd w:val="clear" w:fill="FFF1F2"/>
+          </w:tcPr>
+          <w:p>
+            <w:pPr>
+              <w:spacing w:after="40" w:before="40"/>
+            </w:pPr>
+            <w:r>
+              <w:rPr>
+                <w:rFonts w:ascii="Malgun Gothic" w:hAnsi="Malgun Gothic" w:eastAsia="Malgun Gothic"/>
+                <w:b/>
+                <w:color w:val="E11D48"/>
+                <w:sz w:val="21"/>
+              </w:rPr>
+              <w:t xml:space="preserve">📖 </w:t>
+            </w:r>
+            <w:r>
+              <w:rPr>
+                <w:rFonts w:ascii="Malgun Gothic" w:hAnsi="Malgun Gothic" w:eastAsia="Malgun Gothic"/>
+                <w:b w:val="0"/>
+                <w:color w:val="334155"/>
+                <w:sz w:val="20"/>
+              </w:rPr>
+              <w:t xml:space="preserve">This </w:t>
+            </w:r>
+            <w:r>
+              <w:rPr>
+                <w:rFonts w:ascii="Malgun Gothic" w:hAnsi="Malgun Gothic" w:eastAsia="Malgun Gothic"/>
+                <w:b/>
+                <w:color w:val="334155"/>
+                <w:sz w:val="20"/>
+              </w:rPr>
+              <w:t>merges the old ‘Poster Maker’ and ‘Popup Notice’ tools into one place</w:t>
+            </w:r>
+            <w:r>
+              <w:rPr>
+                <w:rFonts w:ascii="Malgun Gothic" w:hAnsi="Malgun Gothic" w:eastAsia="Malgun Gothic"/>
+                <w:b w:val="0"/>
+                <w:color w:val="334155"/>
+                <w:sz w:val="20"/>
+              </w:rPr>
+              <w:t xml:space="preserve">. In the </w:t>
+            </w:r>
+            <w:r>
+              <w:rPr>
+                <w:rFonts w:ascii="Malgun Gothic" w:hAnsi="Malgun Gothic" w:eastAsia="Malgun Gothic"/>
+                <w:b/>
+                <w:color w:val="334155"/>
+                <w:sz w:val="20"/>
+              </w:rPr>
+              <w:t>①Create</w:t>
+            </w:r>
+            <w:r>
+              <w:rPr>
+                <w:rFonts w:ascii="Malgun Gothic" w:hAnsi="Malgun Gothic" w:eastAsia="Malgun Gothic"/>
+                <w:b w:val="0"/>
+                <w:color w:val="334155"/>
+                <w:sz w:val="20"/>
+              </w:rPr>
+              <w:t xml:space="preserve"> tab you design a notice/event poster, then hand it straight to the </w:t>
+            </w:r>
+            <w:r>
+              <w:rPr>
+                <w:rFonts w:ascii="Malgun Gothic" w:hAnsi="Malgun Gothic" w:eastAsia="Malgun Gothic"/>
+                <w:b/>
+                <w:color w:val="334155"/>
+                <w:sz w:val="20"/>
+              </w:rPr>
+              <w:t>②Publish·Popup</w:t>
+            </w:r>
+            <w:r>
+              <w:rPr>
+                <w:rFonts w:ascii="Malgun Gothic" w:hAnsi="Malgun Gothic" w:eastAsia="Malgun Gothic"/>
+                <w:b w:val="0"/>
+                <w:color w:val="334155"/>
+                <w:sz w:val="20"/>
+              </w:rPr>
+              <w:t xml:space="preserve"> tab to show it as a </w:t>
+            </w:r>
+            <w:r>
+              <w:rPr>
+                <w:rFonts w:ascii="Malgun Gothic" w:hAnsi="Malgun Gothic" w:eastAsia="Malgun Gothic"/>
+                <w:b/>
+                <w:color w:val="334155"/>
+                <w:sz w:val="20"/>
+              </w:rPr>
+              <w:t>popup</w:t>
+            </w:r>
+            <w:r>
+              <w:rPr>
+                <w:rFonts w:ascii="Malgun Gothic" w:hAnsi="Malgun Gothic" w:eastAsia="Malgun Gothic"/>
+                <w:b w:val="0"/>
+                <w:color w:val="334155"/>
+                <w:sz w:val="20"/>
+              </w:rPr>
+              <w:t xml:space="preserve"> in your agency's student app.</w:t>
+            </w:r>
+          </w:p>
+        </w:tc>
+      </w:tr>
+    </w:tbl>
+    <w:p>
+      <w:pPr>
+        <w:spacing w:after="40"/>
+      </w:pPr>
+    </w:p>
+    <w:p>
+      <w:pPr>
+        <w:spacing w:after="40" w:before="0"/>
+      </w:pPr>
+      <w:r>
+        <w:rPr>
+          <w:rFonts w:ascii="Malgun Gothic" w:hAnsi="Malgun Gothic" w:eastAsia="Malgun Gothic"/>
+          <w:b/>
+          <w:color w:val="E11D48"/>
+          <w:sz w:val="22"/>
+        </w:rPr>
+        <w:t>How to use</w:t>
+      </w:r>
+    </w:p>
+    <w:p>
+      <w:pPr>
+        <w:spacing w:after="40"/>
+        <w:ind w:left="288"/>
+      </w:pPr>
+      <w:r>
+        <w:rPr>
+          <w:rFonts w:ascii="Malgun Gothic" w:hAnsi="Malgun Gothic" w:eastAsia="Malgun Gothic"/>
+          <w:b/>
+          <w:color w:val="F59E0B"/>
+          <w:sz w:val="21"/>
+        </w:rPr>
+        <w:t xml:space="preserve">1. </w:t>
+      </w:r>
+      <w:r>
+        <w:rPr>
+          <w:rFonts w:ascii="Malgun Gothic" w:hAnsi="Malgun Gothic" w:eastAsia="Malgun Gothic"/>
+          <w:b w:val="0"/>
+          <w:color w:val="334155"/>
+          <w:sz w:val="21"/>
+        </w:rPr>
+        <w:t xml:space="preserve">Go to the admin menu </w:t>
+      </w:r>
+      <w:r>
+        <w:rPr>
+          <w:rFonts w:ascii="Malgun Gothic" w:hAnsi="Malgun Gothic" w:eastAsia="Malgun Gothic"/>
+          <w:b/>
+          <w:color w:val="E11D48"/>
+          <w:sz w:val="21"/>
+        </w:rPr>
+        <w:t>Notification Center → 📢 Notice Studio</w:t>
+      </w:r>
+      <w:r>
+        <w:rPr>
+          <w:rFonts w:ascii="Malgun Gothic" w:hAnsi="Malgun Gothic" w:eastAsia="Malgun Gothic"/>
+          <w:b w:val="0"/>
+          <w:color w:val="334155"/>
+          <w:sz w:val="21"/>
+        </w:rPr>
+        <w:t>.</w:t>
+      </w:r>
+    </w:p>
+    <w:p>
+      <w:pPr>
+        <w:spacing w:after="40"/>
+        <w:ind w:left="288"/>
+      </w:pPr>
+      <w:r>
+        <w:rPr>
+          <w:rFonts w:ascii="Malgun Gothic" w:hAnsi="Malgun Gothic" w:eastAsia="Malgun Gothic"/>
+          <w:b/>
+          <w:color w:val="F59E0B"/>
+          <w:sz w:val="21"/>
+        </w:rPr>
+        <w:t xml:space="preserve">2. </w:t>
+      </w:r>
+      <w:r>
+        <w:rPr>
+          <w:rFonts w:ascii="Malgun Gothic" w:hAnsi="Malgun Gothic" w:eastAsia="Malgun Gothic"/>
+          <w:b w:val="0"/>
+          <w:color w:val="334155"/>
+          <w:sz w:val="21"/>
+        </w:rPr>
+        <w:t xml:space="preserve">In the </w:t>
+      </w:r>
+      <w:r>
+        <w:rPr>
+          <w:rFonts w:ascii="Malgun Gothic" w:hAnsi="Malgun Gothic" w:eastAsia="Malgun Gothic"/>
+          <w:b/>
+          <w:color w:val="E11D48"/>
+          <w:sz w:val="21"/>
+        </w:rPr>
+        <w:t>①Create</w:t>
+      </w:r>
+      <w:r>
+        <w:rPr>
+          <w:rFonts w:ascii="Malgun Gothic" w:hAnsi="Malgun Gothic" w:eastAsia="Malgun Gothic"/>
+          <w:b w:val="0"/>
+          <w:color w:val="334155"/>
+          <w:sz w:val="21"/>
+        </w:rPr>
+        <w:t xml:space="preserve"> tab, design a poster with text, images, and video (resize · save on server · reuse).</w:t>
+      </w:r>
+    </w:p>
+    <w:p>
+      <w:pPr>
+        <w:spacing w:after="40"/>
+        <w:ind w:left="288"/>
+      </w:pPr>
+      <w:r>
+        <w:rPr>
+          <w:rFonts w:ascii="Malgun Gothic" w:hAnsi="Malgun Gothic" w:eastAsia="Malgun Gothic"/>
+          <w:b/>
+          <w:color w:val="F59E0B"/>
+          <w:sz w:val="21"/>
+        </w:rPr>
+        <w:t xml:space="preserve">3. </w:t>
+      </w:r>
+      <w:r>
+        <w:rPr>
+          <w:rFonts w:ascii="Malgun Gothic" w:hAnsi="Malgun Gothic" w:eastAsia="Malgun Gothic"/>
+          <w:b w:val="0"/>
+          <w:color w:val="334155"/>
+          <w:sz w:val="21"/>
+        </w:rPr>
+        <w:t xml:space="preserve">Press </w:t>
+      </w:r>
+      <w:r>
+        <w:rPr>
+          <w:rFonts w:ascii="Malgun Gothic" w:hAnsi="Malgun Gothic" w:eastAsia="Malgun Gothic"/>
+          <w:b/>
+          <w:color w:val="E11D48"/>
+          <w:sz w:val="21"/>
+        </w:rPr>
+        <w:t>‘📢 Publish as popup’</w:t>
+      </w:r>
+      <w:r>
+        <w:rPr>
+          <w:rFonts w:ascii="Malgun Gothic" w:hAnsi="Malgun Gothic" w:eastAsia="Malgun Gothic"/>
+          <w:b w:val="0"/>
+          <w:color w:val="334155"/>
+          <w:sz w:val="21"/>
+        </w:rPr>
+        <w:t xml:space="preserve"> on the finished poster to auto-switch to the </w:t>
+      </w:r>
+      <w:r>
+        <w:rPr>
+          <w:rFonts w:ascii="Malgun Gothic" w:hAnsi="Malgun Gothic" w:eastAsia="Malgun Gothic"/>
+          <w:b/>
+          <w:color w:val="E11D48"/>
+          <w:sz w:val="21"/>
+        </w:rPr>
+        <w:t>②Publish·Popup</w:t>
+      </w:r>
+      <w:r>
+        <w:rPr>
+          <w:rFonts w:ascii="Malgun Gothic" w:hAnsi="Malgun Gothic" w:eastAsia="Malgun Gothic"/>
+          <w:b w:val="0"/>
+          <w:color w:val="334155"/>
+          <w:sz w:val="21"/>
+        </w:rPr>
+        <w:t xml:space="preserve"> tab.</w:t>
+      </w:r>
+    </w:p>
+    <w:p>
+      <w:pPr>
+        <w:spacing w:after="40"/>
+        <w:ind w:left="288"/>
+      </w:pPr>
+      <w:r>
+        <w:rPr>
+          <w:rFonts w:ascii="Malgun Gothic" w:hAnsi="Malgun Gothic" w:eastAsia="Malgun Gothic"/>
+          <w:b/>
+          <w:color w:val="F59E0B"/>
+          <w:sz w:val="21"/>
+        </w:rPr>
+        <w:t xml:space="preserve">4. </w:t>
+      </w:r>
+      <w:r>
+        <w:rPr>
+          <w:rFonts w:ascii="Malgun Gothic" w:hAnsi="Malgun Gothic" w:eastAsia="Malgun Gothic"/>
+          <w:b w:val="0"/>
+          <w:color w:val="334155"/>
+          <w:sz w:val="21"/>
+        </w:rPr>
+        <w:t xml:space="preserve">In the publish tab, set the </w:t>
+      </w:r>
+      <w:r>
+        <w:rPr>
+          <w:rFonts w:ascii="Malgun Gothic" w:hAnsi="Malgun Gothic" w:eastAsia="Malgun Gothic"/>
+          <w:b/>
+          <w:color w:val="E11D48"/>
+          <w:sz w:val="21"/>
+        </w:rPr>
+        <w:t>display period / stop</w:t>
+      </w:r>
+      <w:r>
+        <w:rPr>
+          <w:rFonts w:ascii="Malgun Gothic" w:hAnsi="Malgun Gothic" w:eastAsia="Malgun Gothic"/>
+          <w:b w:val="0"/>
+          <w:color w:val="334155"/>
+          <w:sz w:val="21"/>
+        </w:rPr>
+        <w:t xml:space="preserve"> and publish it as a student-app popup.</w:t>
+      </w:r>
+    </w:p>
+    <w:p>
+      <w:pPr>
+        <w:spacing w:after="40" w:before="80"/>
+      </w:pPr>
+      <w:r>
+        <w:rPr>
+          <w:rFonts w:ascii="Malgun Gothic" w:hAnsi="Malgun Gothic" w:eastAsia="Malgun Gothic"/>
+          <w:b/>
+          <w:color w:val="E11D48"/>
+          <w:sz w:val="21"/>
+        </w:rPr>
+        <w:t>✅ Key Points</w:t>
+      </w:r>
+    </w:p>
+    <w:p>
+      <w:pPr>
+        <w:spacing w:after="20"/>
+        <w:ind w:left="288"/>
+      </w:pPr>
+      <w:r>
+        <w:rPr>
+          <w:rFonts w:ascii="Malgun Gothic" w:hAnsi="Malgun Gothic"/>
+          <w:color w:val="E11D48"/>
+        </w:rPr>
+        <w:t xml:space="preserve">• </w:t>
+      </w:r>
+      <w:r>
+        <w:rPr>
+          <w:rFonts w:ascii="Malgun Gothic" w:hAnsi="Malgun Gothic" w:eastAsia="Malgun Gothic"/>
+          <w:b w:val="0"/>
+          <w:color w:val="334155"/>
+          <w:sz w:val="20"/>
+        </w:rPr>
+        <w:t xml:space="preserve">Poster creation and popup publishing flow through </w:t>
+      </w:r>
+      <w:r>
+        <w:rPr>
+          <w:rFonts w:ascii="Malgun Gothic" w:hAnsi="Malgun Gothic" w:eastAsia="Malgun Gothic"/>
+          <w:b/>
+          <w:color w:val="E11D48"/>
+          <w:sz w:val="20"/>
+        </w:rPr>
+        <w:t>one screen, two tabs</w:t>
+      </w:r>
+      <w:r>
+        <w:rPr>
+          <w:rFonts w:ascii="Malgun Gothic" w:hAnsi="Malgun Gothic" w:eastAsia="Malgun Gothic"/>
+          <w:b w:val="0"/>
+          <w:color w:val="334155"/>
+          <w:sz w:val="20"/>
+        </w:rPr>
+        <w:t xml:space="preserve"> — no more confusion.</w:t>
+      </w:r>
+    </w:p>
+    <w:p>
+      <w:pPr>
+        <w:spacing w:after="20"/>
+        <w:ind w:left="288"/>
+      </w:pPr>
+      <w:r>
+        <w:rPr>
+          <w:rFonts w:ascii="Malgun Gothic" w:hAnsi="Malgun Gothic"/>
+          <w:color w:val="E11D48"/>
+        </w:rPr>
+        <w:t xml:space="preserve">• </w:t>
+      </w:r>
+      <w:r>
+        <w:rPr>
+          <w:rFonts w:ascii="Malgun Gothic" w:hAnsi="Malgun Gothic" w:eastAsia="Malgun Gothic"/>
+          <w:b w:val="0"/>
+          <w:color w:val="334155"/>
+          <w:sz w:val="20"/>
+        </w:rPr>
+        <w:t xml:space="preserve">Posters you make can be </w:t>
+      </w:r>
+      <w:r>
+        <w:rPr>
+          <w:rFonts w:ascii="Malgun Gothic" w:hAnsi="Malgun Gothic" w:eastAsia="Malgun Gothic"/>
+          <w:b/>
+          <w:color w:val="E11D48"/>
+          <w:sz w:val="20"/>
+        </w:rPr>
+        <w:t>saved and reused</w:t>
+      </w:r>
+      <w:r>
+        <w:rPr>
+          <w:rFonts w:ascii="Malgun Gothic" w:hAnsi="Malgun Gothic" w:eastAsia="Malgun Gothic"/>
+          <w:b w:val="0"/>
+          <w:color w:val="334155"/>
+          <w:sz w:val="20"/>
+        </w:rPr>
+        <w:t>.</w:t>
+      </w:r>
+    </w:p>
+    <w:p>
+      <w:pPr>
+        <w:spacing w:after="20"/>
+        <w:ind w:left="288"/>
+      </w:pPr>
+      <w:r>
+        <w:rPr>
+          <w:rFonts w:ascii="Malgun Gothic" w:hAnsi="Malgun Gothic"/>
+          <w:color w:val="E11D48"/>
+        </w:rPr>
+        <w:t xml:space="preserve">• </w:t>
+      </w:r>
+      <w:r>
+        <w:rPr>
+          <w:rFonts w:ascii="Malgun Gothic" w:hAnsi="Malgun Gothic" w:eastAsia="Malgun Gothic"/>
+          <w:b w:val="0"/>
+          <w:color w:val="334155"/>
+          <w:sz w:val="20"/>
+        </w:rPr>
+        <w:t xml:space="preserve">Whichever route you enter from — AI assistant or sidebar search — the </w:t>
+      </w:r>
+      <w:r>
+        <w:rPr>
+          <w:rFonts w:ascii="Malgun Gothic" w:hAnsi="Malgun Gothic" w:eastAsia="Malgun Gothic"/>
+          <w:b/>
+          <w:color w:val="E11D48"/>
+          <w:sz w:val="20"/>
+        </w:rPr>
+        <w:t>correct tab opens</w:t>
+      </w:r>
+      <w:r>
+        <w:rPr>
+          <w:rFonts w:ascii="Malgun Gothic" w:hAnsi="Malgun Gothic" w:eastAsia="Malgun Gothic"/>
+          <w:b w:val="0"/>
+          <w:color w:val="334155"/>
+          <w:sz w:val="20"/>
+        </w:rPr>
+        <w:t>.</w:t>
+      </w:r>
+    </w:p>
+    <w:tbl>
+      <w:tblPr>
+        <w:tblW w:type="auto" w:w="0"/>
+        <w:jc w:val="center"/>
+        <w:tblLook w:firstColumn="1" w:firstRow="1" w:lastColumn="0" w:lastRow="0" w:noHBand="0" w:noVBand="1" w:val="04A0"/>
+        <w:tblBorders>
+          <w:top w:val="none"/>
+          <w:left w:val="none"/>
+          <w:bottom w:val="none"/>
+          <w:right w:val="none"/>
+          <w:insideH w:val="none"/>
+          <w:insideV w:val="none"/>
+        </w:tblBorders>
+      </w:tblPr>
+      <w:tblGrid>
+        <w:gridCol w:w="9936"/>
+      </w:tblGrid>
+      <w:tr>
+        <w:tc>
+          <w:tcPr>
+            <w:tcW w:type="dxa" w:w="9216"/>
+            <w:shd w:val="clear" w:fill="FFFBEB"/>
+          </w:tcPr>
+          <w:p>
+            <w:pPr>
+              <w:spacing w:after="40" w:before="40"/>
+            </w:pPr>
+            <w:r>
+              <w:rPr>
+                <w:rFonts w:ascii="Malgun Gothic" w:hAnsi="Malgun Gothic" w:eastAsia="Malgun Gothic"/>
+                <w:b/>
+                <w:color w:val="B45309"/>
+                <w:sz w:val="21"/>
+              </w:rPr>
+              <w:t xml:space="preserve">⚠️ Good to know </w:t>
+            </w:r>
+            <w:r>
+              <w:rPr>
+                <w:rFonts w:ascii="Malgun Gothic" w:hAnsi="Malgun Gothic" w:eastAsia="Malgun Gothic"/>
+                <w:b w:val="0"/>
+                <w:color w:val="92670A"/>
+                <w:sz w:val="20"/>
+              </w:rPr>
+              <w:t>Existing posters/popups are preserved (it was only merged, nothing was deleted).</w:t>
+            </w:r>
+          </w:p>
+        </w:tc>
+      </w:tr>
+    </w:tbl>
+    <w:p>
+      <w:pPr>
+        <w:spacing w:after="40"/>
+      </w:pPr>
+    </w:p>
+    <w:tbl>
+      <w:tblPr>
+        <w:tblW w:type="auto" w:w="0"/>
+        <w:jc w:val="center"/>
+        <w:tblLook w:firstColumn="1" w:firstRow="1" w:lastColumn="0" w:lastRow="0" w:noHBand="0" w:noVBand="1" w:val="04A0"/>
+        <w:tblBorders>
+          <w:top w:val="none"/>
+          <w:left w:val="none"/>
+          <w:bottom w:val="none"/>
+          <w:right w:val="none"/>
+          <w:insideH w:val="none"/>
+          <w:insideV w:val="none"/>
+        </w:tblBorders>
+      </w:tblPr>
+      <w:tblGrid>
+        <w:gridCol w:w="9936"/>
+      </w:tblGrid>
+      <w:tr>
+        <w:tc>
+          <w:tcPr>
+            <w:tcW w:type="dxa" w:w="9216"/>
+            <w:shd w:val="clear" w:fill="FFF7E6"/>
+          </w:tcPr>
+          <w:p>
+            <w:pPr>
+              <w:spacing w:after="40" w:before="40"/>
+            </w:pPr>
+            <w:r>
+              <w:rPr>
+                <w:rFonts w:ascii="Malgun Gothic" w:hAnsi="Malgun Gothic" w:eastAsia="Malgun Gothic"/>
+                <w:b/>
+                <w:color w:val="E8630A"/>
+                <w:sz w:val="21"/>
+              </w:rPr>
+              <w:t xml:space="preserve">💡 Tip </w:t>
+            </w:r>
+            <w:r>
+              <w:rPr>
+                <w:rFonts w:ascii="Malgun Gothic" w:hAnsi="Malgun Gothic" w:eastAsia="Malgun Gothic"/>
+                <w:b w:val="0"/>
+                <w:color w:val="5B4A2A"/>
+                <w:sz w:val="20"/>
+              </w:rPr>
+              <w:t>Promoting an event takes just one flow: ‘Create → Publish as popup’ right away.</w:t>
+            </w:r>
+          </w:p>
+        </w:tc>
+      </w:tr>
+    </w:tbl>
+    <w:p>
+      <w:pPr>
+        <w:spacing w:after="40"/>
+      </w:pPr>
+    </w:p>
+    <w:p>
+      <w:pPr>
+        <w:spacing w:before="80" w:after="160"/>
+        <w:jc w:val="center"/>
+      </w:pPr>
+      <w:r>
+        <w:drawing>
+          <wp:inline xmlns:a="http://schemas.openxmlformats.org/drawingml/2006/main" xmlns:pic="http://schemas.openxmlformats.org/drawingml/2006/picture">
+            <wp:extent cx="5669280" cy="3543300"/>
+            <wp:docPr id="19" name="Picture 19"/>
+            <wp:cNvGraphicFramePr>
+              <a:graphicFrameLocks noChangeAspect="1"/>
+            </wp:cNvGraphicFramePr>
+            <a:graphic>
+              <a:graphicData uri="http://schemas.openxmlformats.org/drawingml/2006/picture">
+                <pic:pic>
+                  <pic:nvPicPr>
+                    <pic:cNvPr id="0" name="admin_noticestudio.jpg"/>
+                    <pic:cNvPicPr/>
+                  </pic:nvPicPr>
+                  <pic:blipFill>
+                    <a:blip r:embed="rId22"/>
+                    <a:stretch>
+                      <a:fillRect/>
+                    </a:stretch>
+                  </pic:blipFill>
+                  <pic:spPr>
+                    <a:xfrm>
+                      <a:off x="0" y="0"/>
+                      <a:ext cx="5669280" cy="3543300"/>
+                    </a:xfrm>
+                    <a:prstGeom prst="rect"/>
+                  </pic:spPr>
+                </pic:pic>
+              </a:graphicData>
+            </a:graphic>
+          </wp:inline>
+        </w:drawing>
+      </w:r>
+    </w:p>
+    <w:p>
+      <w:pPr>
+        <w:spacing w:before="240" w:after="40"/>
+      </w:pPr>
+      <w:r>
+        <w:rPr>
+          <w:rFonts w:ascii="Malgun Gothic" w:hAnsi="Malgun Gothic" w:eastAsia="Malgun Gothic"/>
+          <w:b/>
+          <w:color w:val="E11D48"/>
+          <w:sz w:val="28"/>
+        </w:rPr>
+        <w:t>18.  🤖 Command the AI Operations Assistant</w:t>
+      </w:r>
+    </w:p>
+    <w:p>
+      <w:pPr>
+        <w:spacing w:after="120" w:before="0"/>
+      </w:pPr>
+      <w:r>
+        <w:rPr>
+          <w:rFonts w:ascii="Malgun Gothic" w:hAnsi="Malgun Gothic" w:eastAsia="Malgun Gothic"/>
+          <w:b w:val="0"/>
+          <w:color w:val="64748B"/>
+          <w:sz w:val="21"/>
+        </w:rPr>
+        <w:t>Navigate with one phrase: “Take me to ○○”</w:t>
+      </w:r>
+    </w:p>
+    <w:tbl>
+      <w:tblPr>
+        <w:tblW w:type="auto" w:w="0"/>
+        <w:jc w:val="center"/>
+        <w:tblLook w:firstColumn="1" w:firstRow="1" w:lastColumn="0" w:lastRow="0" w:noHBand="0" w:noVBand="1" w:val="04A0"/>
+        <w:tblBorders>
+          <w:top w:val="none"/>
+          <w:left w:val="none"/>
+          <w:bottom w:val="none"/>
+          <w:right w:val="none"/>
+          <w:insideH w:val="none"/>
+          <w:insideV w:val="none"/>
+        </w:tblBorders>
+      </w:tblPr>
+      <w:tblGrid>
+        <w:gridCol w:w="9936"/>
+      </w:tblGrid>
+      <w:tr>
+        <w:tc>
+          <w:tcPr>
+            <w:tcW w:type="dxa" w:w="9216"/>
+            <w:shd w:val="clear" w:fill="FFF1F2"/>
+          </w:tcPr>
+          <w:p>
+            <w:pPr>
+              <w:spacing w:after="40" w:before="40"/>
+            </w:pPr>
+            <w:r>
+              <w:rPr>
+                <w:rFonts w:ascii="Malgun Gothic" w:hAnsi="Malgun Gothic" w:eastAsia="Malgun Gothic"/>
+                <w:b/>
+                <w:color w:val="E11D48"/>
+                <w:sz w:val="21"/>
+              </w:rPr>
+              <w:t xml:space="preserve">📖 </w:t>
+            </w:r>
+            <w:r>
+              <w:rPr>
+                <w:rFonts w:ascii="Malgun Gothic" w:hAnsi="Malgun Gothic" w:eastAsia="Malgun Gothic"/>
+                <w:b w:val="0"/>
+                <w:color w:val="334155"/>
+                <w:sz w:val="20"/>
+              </w:rPr>
+              <w:t xml:space="preserve">Type what you want to do into the </w:t>
+            </w:r>
+            <w:r>
+              <w:rPr>
+                <w:rFonts w:ascii="Malgun Gothic" w:hAnsi="Malgun Gothic" w:eastAsia="Malgun Gothic"/>
+                <w:b/>
+                <w:color w:val="334155"/>
+                <w:sz w:val="20"/>
+              </w:rPr>
+              <w:t>top search bar (or the bottom-right AI assistant)</w:t>
+            </w:r>
+            <w:r>
+              <w:rPr>
+                <w:rFonts w:ascii="Malgun Gothic" w:hAnsi="Malgun Gothic" w:eastAsia="Malgun Gothic"/>
+                <w:b w:val="0"/>
+                <w:color w:val="334155"/>
+                <w:sz w:val="20"/>
+              </w:rPr>
+              <w:t xml:space="preserve"> in plain language, and the AI understands and </w:t>
+            </w:r>
+            <w:r>
+              <w:rPr>
+                <w:rFonts w:ascii="Malgun Gothic" w:hAnsi="Malgun Gothic" w:eastAsia="Malgun Gothic"/>
+                <w:b/>
+                <w:color w:val="334155"/>
+                <w:sz w:val="20"/>
+              </w:rPr>
+              <w:t>jumps straight to that screen</w:t>
+            </w:r>
+            <w:r>
+              <w:rPr>
+                <w:rFonts w:ascii="Malgun Gothic" w:hAnsi="Malgun Gothic" w:eastAsia="Malgun Gothic"/>
+                <w:b w:val="0"/>
+                <w:color w:val="334155"/>
+                <w:sz w:val="20"/>
+              </w:rPr>
+              <w:t xml:space="preserve">. It now reliably follows navigation commands like </w:t>
+            </w:r>
+            <w:r>
+              <w:rPr>
+                <w:rFonts w:ascii="Malgun Gothic" w:hAnsi="Malgun Gothic" w:eastAsia="Malgun Gothic"/>
+                <w:b/>
+                <w:color w:val="334155"/>
+                <w:sz w:val="20"/>
+              </w:rPr>
+              <w:t>‘Take me to teacher ○○'s schedule’</w:t>
+            </w:r>
+            <w:r>
+              <w:rPr>
+                <w:rFonts w:ascii="Malgun Gothic" w:hAnsi="Malgun Gothic" w:eastAsia="Malgun Gothic"/>
+                <w:b w:val="0"/>
+                <w:color w:val="334155"/>
+                <w:sz w:val="20"/>
+              </w:rPr>
+              <w:t xml:space="preserve"> or </w:t>
+            </w:r>
+            <w:r>
+              <w:rPr>
+                <w:rFonts w:ascii="Malgun Gothic" w:hAnsi="Malgun Gothic" w:eastAsia="Malgun Gothic"/>
+                <w:b/>
+                <w:color w:val="334155"/>
+                <w:sz w:val="20"/>
+              </w:rPr>
+              <w:t>‘Open auto-scheduling’</w:t>
+            </w:r>
+            <w:r>
+              <w:rPr>
+                <w:rFonts w:ascii="Malgun Gothic" w:hAnsi="Malgun Gothic" w:eastAsia="Malgun Gothic"/>
+                <w:b w:val="0"/>
+                <w:color w:val="334155"/>
+                <w:sz w:val="20"/>
+              </w:rPr>
+              <w:t>.</w:t>
+            </w:r>
+          </w:p>
+        </w:tc>
+      </w:tr>
+    </w:tbl>
+    <w:p>
+      <w:pPr>
+        <w:spacing w:after="40"/>
+      </w:pPr>
+    </w:p>
+    <w:p>
+      <w:pPr>
+        <w:spacing w:after="40" w:before="0"/>
+      </w:pPr>
+      <w:r>
+        <w:rPr>
+          <w:rFonts w:ascii="Malgun Gothic" w:hAnsi="Malgun Gothic" w:eastAsia="Malgun Gothic"/>
+          <w:b/>
+          <w:color w:val="E11D48"/>
+          <w:sz w:val="22"/>
+        </w:rPr>
+        <w:t>How to use</w:t>
+      </w:r>
+    </w:p>
+    <w:p>
+      <w:pPr>
+        <w:spacing w:after="40"/>
+        <w:ind w:left="288"/>
+      </w:pPr>
+      <w:r>
+        <w:rPr>
+          <w:rFonts w:ascii="Malgun Gothic" w:hAnsi="Malgun Gothic" w:eastAsia="Malgun Gothic"/>
+          <w:b/>
+          <w:color w:val="F59E0B"/>
+          <w:sz w:val="21"/>
+        </w:rPr>
+        <w:t xml:space="preserve">1. </w:t>
+      </w:r>
+      <w:r>
+        <w:rPr>
+          <w:rFonts w:ascii="Malgun Gothic" w:hAnsi="Malgun Gothic" w:eastAsia="Malgun Gothic"/>
+          <w:b w:val="0"/>
+          <w:color w:val="334155"/>
+          <w:sz w:val="21"/>
+        </w:rPr>
+        <w:t xml:space="preserve">Type a command in the top </w:t>
+      </w:r>
+      <w:r>
+        <w:rPr>
+          <w:rFonts w:ascii="Malgun Gothic" w:hAnsi="Malgun Gothic" w:eastAsia="Malgun Gothic"/>
+          <w:b/>
+          <w:color w:val="E11D48"/>
+          <w:sz w:val="21"/>
+        </w:rPr>
+        <w:t>search bar</w:t>
+      </w:r>
+      <w:r>
+        <w:rPr>
+          <w:rFonts w:ascii="Malgun Gothic" w:hAnsi="Malgun Gothic" w:eastAsia="Malgun Gothic"/>
+          <w:b w:val="0"/>
+          <w:color w:val="334155"/>
+          <w:sz w:val="21"/>
+        </w:rPr>
+        <w:t xml:space="preserve"> or speak with the 🎤 mic.</w:t>
+      </w:r>
+    </w:p>
+    <w:p>
+      <w:pPr>
+        <w:spacing w:after="40"/>
+        <w:ind w:left="288"/>
+      </w:pPr>
+      <w:r>
+        <w:rPr>
+          <w:rFonts w:ascii="Malgun Gothic" w:hAnsi="Malgun Gothic" w:eastAsia="Malgun Gothic"/>
+          <w:b/>
+          <w:color w:val="F59E0B"/>
+          <w:sz w:val="21"/>
+        </w:rPr>
+        <w:t xml:space="preserve">2. </w:t>
+      </w:r>
+      <w:r>
+        <w:rPr>
+          <w:rFonts w:ascii="Malgun Gothic" w:hAnsi="Malgun Gothic" w:eastAsia="Malgun Gothic"/>
+          <w:b w:val="0"/>
+          <w:color w:val="334155"/>
+          <w:sz w:val="21"/>
+        </w:rPr>
+        <w:t xml:space="preserve">e.g. </w:t>
+      </w:r>
+      <w:r>
+        <w:rPr>
+          <w:rFonts w:ascii="Malgun Gothic" w:hAnsi="Malgun Gothic" w:eastAsia="Malgun Gothic"/>
+          <w:b/>
+          <w:color w:val="E11D48"/>
+          <w:sz w:val="21"/>
+        </w:rPr>
+        <w:t>“Take me to teacher Kim Minji's schedule”</w:t>
+      </w:r>
+      <w:r>
+        <w:rPr>
+          <w:rFonts w:ascii="Malgun Gothic" w:hAnsi="Malgun Gothic" w:eastAsia="Malgun Gothic"/>
+          <w:b w:val="0"/>
+          <w:color w:val="334155"/>
+          <w:sz w:val="21"/>
+        </w:rPr>
+        <w:t xml:space="preserve"> → auto-finds that teacher in the weekly schedule and opens it.</w:t>
+      </w:r>
+    </w:p>
+    <w:p>
+      <w:pPr>
+        <w:spacing w:after="40"/>
+        <w:ind w:left="288"/>
+      </w:pPr>
+      <w:r>
+        <w:rPr>
+          <w:rFonts w:ascii="Malgun Gothic" w:hAnsi="Malgun Gothic" w:eastAsia="Malgun Gothic"/>
+          <w:b/>
+          <w:color w:val="F59E0B"/>
+          <w:sz w:val="21"/>
+        </w:rPr>
+        <w:t xml:space="preserve">3. </w:t>
+      </w:r>
+      <w:r>
+        <w:rPr>
+          <w:rFonts w:ascii="Malgun Gothic" w:hAnsi="Malgun Gothic" w:eastAsia="Malgun Gothic"/>
+          <w:b w:val="0"/>
+          <w:color w:val="334155"/>
+          <w:sz w:val="21"/>
+        </w:rPr>
+        <w:t xml:space="preserve">e.g. </w:t>
+      </w:r>
+      <w:r>
+        <w:rPr>
+          <w:rFonts w:ascii="Malgun Gothic" w:hAnsi="Malgun Gothic" w:eastAsia="Malgun Gothic"/>
+          <w:b/>
+          <w:color w:val="E11D48"/>
+          <w:sz w:val="21"/>
+        </w:rPr>
+        <w:t>“Open auto-scheduling,” “Go to settlement”</w:t>
+      </w:r>
+      <w:r>
+        <w:rPr>
+          <w:rFonts w:ascii="Malgun Gothic" w:hAnsi="Malgun Gothic" w:eastAsia="Malgun Gothic"/>
+          <w:b w:val="0"/>
+          <w:color w:val="334155"/>
+          <w:sz w:val="21"/>
+        </w:rPr>
+        <w:t xml:space="preserve"> to navigate menus.</w:t>
+      </w:r>
+    </w:p>
+    <w:p>
+      <w:pPr>
+        <w:spacing w:after="40"/>
+        <w:ind w:left="288"/>
+      </w:pPr>
+      <w:r>
+        <w:rPr>
+          <w:rFonts w:ascii="Malgun Gothic" w:hAnsi="Malgun Gothic" w:eastAsia="Malgun Gothic"/>
+          <w:b/>
+          <w:color w:val="F59E0B"/>
+          <w:sz w:val="21"/>
+        </w:rPr>
+        <w:t xml:space="preserve">4. </w:t>
+      </w:r>
+      <w:r>
+        <w:rPr>
+          <w:rFonts w:ascii="Malgun Gothic" w:hAnsi="Malgun Gothic" w:eastAsia="Malgun Gothic"/>
+          <w:b w:val="0"/>
+          <w:color w:val="334155"/>
+          <w:sz w:val="21"/>
+        </w:rPr>
+        <w:t xml:space="preserve">Press </w:t>
+      </w:r>
+      <w:r>
+        <w:rPr>
+          <w:rFonts w:ascii="Malgun Gothic" w:hAnsi="Malgun Gothic" w:eastAsia="Malgun Gothic"/>
+          <w:b/>
+          <w:color w:val="E11D48"/>
+          <w:sz w:val="21"/>
+        </w:rPr>
+        <w:t>‘Go now →’</w:t>
+      </w:r>
+      <w:r>
+        <w:rPr>
+          <w:rFonts w:ascii="Malgun Gothic" w:hAnsi="Malgun Gothic" w:eastAsia="Malgun Gothic"/>
+          <w:b w:val="0"/>
+          <w:color w:val="334155"/>
+          <w:sz w:val="21"/>
+        </w:rPr>
+        <w:t xml:space="preserve"> on the AI response card to move to that screen.</w:t>
+      </w:r>
+    </w:p>
+    <w:p>
+      <w:pPr>
+        <w:spacing w:after="40" w:before="80"/>
+      </w:pPr>
+      <w:r>
+        <w:rPr>
+          <w:rFonts w:ascii="Malgun Gothic" w:hAnsi="Malgun Gothic" w:eastAsia="Malgun Gothic"/>
+          <w:b/>
+          <w:color w:val="E11D48"/>
+          <w:sz w:val="21"/>
+        </w:rPr>
+        <w:t>✅ Key Points</w:t>
+      </w:r>
+    </w:p>
+    <w:p>
+      <w:pPr>
+        <w:spacing w:after="20"/>
+        <w:ind w:left="288"/>
+      </w:pPr>
+      <w:r>
+        <w:rPr>
+          <w:rFonts w:ascii="Malgun Gothic" w:hAnsi="Malgun Gothic"/>
+          <w:color w:val="E11D48"/>
+        </w:rPr>
+        <w:t xml:space="preserve">• </w:t>
+      </w:r>
+      <w:r>
+        <w:rPr>
+          <w:rFonts w:ascii="Malgun Gothic" w:hAnsi="Malgun Gothic" w:eastAsia="Malgun Gothic"/>
+          <w:b w:val="0"/>
+          <w:color w:val="334155"/>
+          <w:sz w:val="20"/>
+        </w:rPr>
+        <w:t xml:space="preserve">Navigation commands </w:t>
+      </w:r>
+      <w:r>
+        <w:rPr>
+          <w:rFonts w:ascii="Malgun Gothic" w:hAnsi="Malgun Gothic" w:eastAsia="Malgun Gothic"/>
+          <w:b/>
+          <w:color w:val="E11D48"/>
+          <w:sz w:val="20"/>
+        </w:rPr>
+        <w:t>actually navigate</w:t>
+      </w:r>
+      <w:r>
+        <w:rPr>
+          <w:rFonts w:ascii="Malgun Gothic" w:hAnsi="Malgun Gothic" w:eastAsia="Malgun Gothic"/>
+          <w:b w:val="0"/>
+          <w:color w:val="334155"/>
+          <w:sz w:val="20"/>
+        </w:rPr>
+        <w:t xml:space="preserve"> — far fewer ‘explain only, do nothing’ replies.</w:t>
+      </w:r>
+    </w:p>
+    <w:p>
+      <w:pPr>
+        <w:spacing w:after="20"/>
+        <w:ind w:left="288"/>
+      </w:pPr>
+      <w:r>
+        <w:rPr>
+          <w:rFonts w:ascii="Malgun Gothic" w:hAnsi="Malgun Gothic"/>
+          <w:color w:val="E11D48"/>
+        </w:rPr>
+        <w:t xml:space="preserve">• </w:t>
+      </w:r>
+      <w:r>
+        <w:rPr>
+          <w:rFonts w:ascii="Malgun Gothic" w:hAnsi="Malgun Gothic" w:eastAsia="Malgun Gothic"/>
+          <w:b w:val="0"/>
+          <w:color w:val="334155"/>
+          <w:sz w:val="20"/>
+        </w:rPr>
+        <w:t xml:space="preserve">Searching a schedule by teacher name </w:t>
+      </w:r>
+      <w:r>
+        <w:rPr>
+          <w:rFonts w:ascii="Malgun Gothic" w:hAnsi="Malgun Gothic" w:eastAsia="Malgun Gothic"/>
+          <w:b/>
+          <w:color w:val="E11D48"/>
+          <w:sz w:val="20"/>
+        </w:rPr>
+        <w:t>auto-fills the search box + filters + scrolls</w:t>
+      </w:r>
+      <w:r>
+        <w:rPr>
+          <w:rFonts w:ascii="Malgun Gothic" w:hAnsi="Malgun Gothic" w:eastAsia="Malgun Gothic"/>
+          <w:b w:val="0"/>
+          <w:color w:val="334155"/>
+          <w:sz w:val="20"/>
+        </w:rPr>
+        <w:t>.</w:t>
+      </w:r>
+    </w:p>
+    <w:p>
+      <w:pPr>
+        <w:spacing w:after="20"/>
+        <w:ind w:left="288"/>
+      </w:pPr>
+      <w:r>
+        <w:rPr>
+          <w:rFonts w:ascii="Malgun Gothic" w:hAnsi="Malgun Gothic"/>
+          <w:color w:val="E11D48"/>
+        </w:rPr>
+        <w:t xml:space="preserve">• </w:t>
+      </w:r>
+      <w:r>
+        <w:rPr>
+          <w:rFonts w:ascii="Malgun Gothic" w:hAnsi="Malgun Gothic" w:eastAsia="Malgun Gothic"/>
+          <w:b w:val="0"/>
+          <w:color w:val="334155"/>
+          <w:sz w:val="20"/>
+        </w:rPr>
+        <w:t xml:space="preserve">For data/statistics questions it also helps with </w:t>
+      </w:r>
+      <w:r>
+        <w:rPr>
+          <w:rFonts w:ascii="Malgun Gothic" w:hAnsi="Malgun Gothic" w:eastAsia="Malgun Gothic"/>
+          <w:b/>
+          <w:color w:val="E11D48"/>
+          <w:sz w:val="20"/>
+        </w:rPr>
+        <w:t>card-style answers</w:t>
+      </w:r>
+      <w:r>
+        <w:rPr>
+          <w:rFonts w:ascii="Malgun Gothic" w:hAnsi="Malgun Gothic" w:eastAsia="Malgun Gothic"/>
+          <w:b w:val="0"/>
+          <w:color w:val="334155"/>
+          <w:sz w:val="20"/>
+        </w:rPr>
+        <w:t>.</w:t>
+      </w:r>
+    </w:p>
+    <w:tbl>
+      <w:tblPr>
+        <w:tblW w:type="auto" w:w="0"/>
+        <w:jc w:val="center"/>
+        <w:tblLook w:firstColumn="1" w:firstRow="1" w:lastColumn="0" w:lastRow="0" w:noHBand="0" w:noVBand="1" w:val="04A0"/>
+        <w:tblBorders>
+          <w:top w:val="none"/>
+          <w:left w:val="none"/>
+          <w:bottom w:val="none"/>
+          <w:right w:val="none"/>
+          <w:insideH w:val="none"/>
+          <w:insideV w:val="none"/>
+        </w:tblBorders>
+      </w:tblPr>
+      <w:tblGrid>
+        <w:gridCol w:w="9936"/>
+      </w:tblGrid>
+      <w:tr>
+        <w:tc>
+          <w:tcPr>
+            <w:tcW w:type="dxa" w:w="9216"/>
+            <w:shd w:val="clear" w:fill="FFFBEB"/>
+          </w:tcPr>
+          <w:p>
+            <w:pPr>
+              <w:spacing w:after="40" w:before="40"/>
+            </w:pPr>
+            <w:r>
+              <w:rPr>
+                <w:rFonts w:ascii="Malgun Gothic" w:hAnsi="Malgun Gothic" w:eastAsia="Malgun Gothic"/>
+                <w:b/>
+                <w:color w:val="B45309"/>
+                <w:sz w:val="21"/>
+              </w:rPr>
+              <w:t xml:space="preserve">⚠️ Good to know </w:t>
+            </w:r>
+            <w:r>
+              <w:rPr>
+                <w:rFonts w:ascii="Malgun Gothic" w:hAnsi="Malgun Gothic" w:eastAsia="Malgun Gothic"/>
+                <w:b w:val="0"/>
+                <w:color w:val="92670A"/>
+                <w:sz w:val="20"/>
+              </w:rPr>
+              <w:t>Commands that actually change things — ‘register · send · modify’ — ask for one more confirmation (a safety guard).</w:t>
+            </w:r>
+          </w:p>
+        </w:tc>
+      </w:tr>
+    </w:tbl>
+    <w:p>
+      <w:pPr>
+        <w:spacing w:after="40"/>
+      </w:pPr>
+    </w:p>
+    <w:tbl>
+      <w:tblPr>
+        <w:tblW w:type="auto" w:w="0"/>
+        <w:jc w:val="center"/>
+        <w:tblLook w:firstColumn="1" w:firstRow="1" w:lastColumn="0" w:lastRow="0" w:noHBand="0" w:noVBand="1" w:val="04A0"/>
+        <w:tblBorders>
+          <w:top w:val="none"/>
+          <w:left w:val="none"/>
+          <w:bottom w:val="none"/>
+          <w:right w:val="none"/>
+          <w:insideH w:val="none"/>
+          <w:insideV w:val="none"/>
+        </w:tblBorders>
+      </w:tblPr>
+      <w:tblGrid>
+        <w:gridCol w:w="9936"/>
+      </w:tblGrid>
+      <w:tr>
+        <w:tc>
+          <w:tcPr>
+            <w:tcW w:type="dxa" w:w="9216"/>
+            <w:shd w:val="clear" w:fill="FFF7E6"/>
+          </w:tcPr>
+          <w:p>
+            <w:pPr>
+              <w:spacing w:after="40" w:before="40"/>
+            </w:pPr>
+            <w:r>
+              <w:rPr>
+                <w:rFonts w:ascii="Malgun Gothic" w:hAnsi="Malgun Gothic" w:eastAsia="Malgun Gothic"/>
+                <w:b/>
+                <w:color w:val="E8630A"/>
+                <w:sz w:val="21"/>
+              </w:rPr>
+              <w:t xml:space="preserve">💡 Tip </w:t>
+            </w:r>
+            <w:r>
+              <w:rPr>
+                <w:rFonts w:ascii="Malgun Gothic" w:hAnsi="Malgun Gothic" w:eastAsia="Malgun Gothic"/>
+                <w:b w:val="0"/>
+                <w:color w:val="5B4A2A"/>
+                <w:sz w:val="20"/>
+              </w:rPr>
+              <w:t>When you can't recall a menu name, just say what you want to do — it finds its way there.</w:t>
+            </w:r>
+          </w:p>
+        </w:tc>
+      </w:tr>
+    </w:tbl>
+    <w:p>
+      <w:pPr>
+        <w:spacing w:after="40"/>
+      </w:pPr>
+    </w:p>
+    <w:p>
+      <w:pPr>
+        <w:spacing w:before="80" w:after="160"/>
+        <w:jc w:val="center"/>
+      </w:pPr>
+      <w:r>
+        <w:drawing>
+          <wp:inline xmlns:a="http://schemas.openxmlformats.org/drawingml/2006/main" xmlns:pic="http://schemas.openxmlformats.org/drawingml/2006/picture">
+            <wp:extent cx="5669280" cy="3543300"/>
+            <wp:docPr id="20" name="Picture 20"/>
+            <wp:cNvGraphicFramePr>
+              <a:graphicFrameLocks noChangeAspect="1"/>
+            </wp:cNvGraphicFramePr>
+            <a:graphic>
+              <a:graphicData uri="http://schemas.openxmlformats.org/drawingml/2006/picture">
+                <pic:pic>
+                  <pic:nvPicPr>
+                    <pic:cNvPr id="0" name="admin_aicommand.jpg"/>
+                    <pic:cNvPicPr/>
+                  </pic:nvPicPr>
+                  <pic:blipFill>
+                    <a:blip r:embed="rId23"/>
+                    <a:stretch>
+                      <a:fillRect/>
+                    </a:stretch>
+                  </pic:blipFill>
+                  <pic:spPr>
+                    <a:xfrm>
+                      <a:off x="0" y="0"/>
+                      <a:ext cx="5669280" cy="3543300"/>
                     </a:xfrm>
                     <a:prstGeom prst="rect"/>
                   </pic:spPr>

</xml_diff>

<commit_message>
deploy: 2026-07-14 19:27 (build 20260714192715)
</commit_message>
<xml_diff>
--- a/cloudflare-deploy/public/library/agency/agency-en.docx
+++ b/cloudflare-deploy/public/library/agency/agency-en.docx
@@ -7848,6 +7848,497 @@
                   </pic:nvPicPr>
                   <pic:blipFill>
                     <a:blip r:embed="rId23"/>
+                    <a:stretch>
+                      <a:fillRect/>
+                    </a:stretch>
+                  </pic:blipFill>
+                  <pic:spPr>
+                    <a:xfrm>
+                      <a:off x="0" y="0"/>
+                      <a:ext cx="5669280" cy="3543300"/>
+                    </a:xfrm>
+                    <a:prstGeom prst="rect"/>
+                  </pic:spPr>
+                </pic:pic>
+              </a:graphicData>
+            </a:graphic>
+          </wp:inline>
+        </w:drawing>
+      </w:r>
+    </w:p>
+    <w:p>
+      <w:pPr>
+        <w:spacing w:before="240" w:after="40"/>
+      </w:pPr>
+      <w:r>
+        <w:rPr>
+          <w:rFonts w:ascii="Malgun Gothic" w:hAnsi="Malgun Gothic" w:eastAsia="Malgun Gothic"/>
+          <w:b/>
+          <w:color w:val="E11D48"/>
+          <w:sz w:val="28"/>
+        </w:rPr>
+        <w:t>19.  💬 Share Library Links via KakaoTalk</w:t>
+      </w:r>
+    </w:p>
+    <w:p>
+      <w:pPr>
+        <w:spacing w:after="120" w:before="0"/>
+      </w:pPr>
+      <w:r>
+        <w:rPr>
+          <w:rFonts w:ascii="Malgun Gothic" w:hAnsi="Malgun Gothic" w:eastAsia="Malgun Gothic"/>
+          <w:b w:val="0"/>
+          <w:color w:val="64748B"/>
+          <w:sz w:val="21"/>
+        </w:rPr>
+        <w:t>Send videos &amp; docs in original quality</w:t>
+      </w:r>
+    </w:p>
+    <w:tbl>
+      <w:tblPr>
+        <w:tblW w:type="auto" w:w="0"/>
+        <w:jc w:val="center"/>
+        <w:tblLook w:firstColumn="1" w:firstRow="1" w:lastColumn="0" w:lastRow="0" w:noHBand="0" w:noVBand="1" w:val="04A0"/>
+        <w:tblBorders>
+          <w:top w:val="none"/>
+          <w:left w:val="none"/>
+          <w:bottom w:val="none"/>
+          <w:right w:val="none"/>
+          <w:insideH w:val="none"/>
+          <w:insideV w:val="none"/>
+        </w:tblBorders>
+      </w:tblPr>
+      <w:tblGrid>
+        <w:gridCol w:w="9936"/>
+      </w:tblGrid>
+      <w:tr>
+        <w:tc>
+          <w:tcPr>
+            <w:tcW w:type="dxa" w:w="9216"/>
+            <w:shd w:val="clear" w:fill="FFF1F2"/>
+          </w:tcPr>
+          <w:p>
+            <w:pPr>
+              <w:spacing w:after="40" w:before="40"/>
+            </w:pPr>
+            <w:r>
+              <w:rPr>
+                <w:rFonts w:ascii="Malgun Gothic" w:hAnsi="Malgun Gothic" w:eastAsia="Malgun Gothic"/>
+                <w:b/>
+                <w:color w:val="E11D48"/>
+                <w:sz w:val="21"/>
+              </w:rPr>
+              <w:t xml:space="preserve">📖 </w:t>
+            </w:r>
+            <w:r>
+              <w:rPr>
+                <w:rFonts w:ascii="Malgun Gothic" w:hAnsi="Malgun Gothic" w:eastAsia="Malgun Gothic"/>
+                <w:b w:val="0"/>
+                <w:color w:val="334155"/>
+                <w:sz w:val="20"/>
+              </w:rPr>
+              <w:t xml:space="preserve">Every guide and video in the library now has a </w:t>
+            </w:r>
+            <w:r>
+              <w:rPr>
+                <w:rFonts w:ascii="Malgun Gothic" w:hAnsi="Malgun Gothic" w:eastAsia="Malgun Gothic"/>
+                <w:b/>
+                <w:color w:val="334155"/>
+                <w:sz w:val="20"/>
+              </w:rPr>
+              <w:t>'💬 Copy KakaoTalk link' button</w:t>
+            </w:r>
+            <w:r>
+              <w:rPr>
+                <w:rFonts w:ascii="Malgun Gothic" w:hAnsi="Malgun Gothic" w:eastAsia="Malgun Gothic"/>
+                <w:b w:val="0"/>
+                <w:color w:val="334155"/>
+                <w:sz w:val="20"/>
+              </w:rPr>
+              <w:t xml:space="preserve">. </w:t>
+            </w:r>
+            <w:r>
+              <w:rPr>
+                <w:rFonts w:ascii="Malgun Gothic" w:hAnsi="Malgun Gothic" w:eastAsia="Malgun Gothic"/>
+                <w:b/>
+                <w:color w:val="334155"/>
+                <w:sz w:val="20"/>
+              </w:rPr>
+              <w:t>Attaching a file to KakaoTalk crushes the quality, but sending a link plays the original</w:t>
+            </w:r>
+            <w:r>
+              <w:rPr>
+                <w:rFonts w:ascii="Malgun Gothic" w:hAnsi="Malgun Gothic" w:eastAsia="Malgun Gothic"/>
+                <w:b w:val="0"/>
+                <w:color w:val="334155"/>
+                <w:sz w:val="20"/>
+              </w:rPr>
+              <w:t xml:space="preserve"> as-is. One tap copies the link — guiding parents and teachers gets much easier.</w:t>
+            </w:r>
+          </w:p>
+        </w:tc>
+      </w:tr>
+    </w:tbl>
+    <w:p>
+      <w:pPr>
+        <w:spacing w:after="40"/>
+      </w:pPr>
+    </w:p>
+    <w:p>
+      <w:pPr>
+        <w:spacing w:after="40" w:before="0"/>
+      </w:pPr>
+      <w:r>
+        <w:rPr>
+          <w:rFonts w:ascii="Malgun Gothic" w:hAnsi="Malgun Gothic" w:eastAsia="Malgun Gothic"/>
+          <w:b/>
+          <w:color w:val="E11D48"/>
+          <w:sz w:val="22"/>
+        </w:rPr>
+        <w:t>How to use</w:t>
+      </w:r>
+    </w:p>
+    <w:p>
+      <w:pPr>
+        <w:spacing w:after="40"/>
+        <w:ind w:left="288"/>
+      </w:pPr>
+      <w:r>
+        <w:rPr>
+          <w:rFonts w:ascii="Malgun Gothic" w:hAnsi="Malgun Gothic" w:eastAsia="Malgun Gothic"/>
+          <w:b/>
+          <w:color w:val="F59E0B"/>
+          <w:sz w:val="21"/>
+        </w:rPr>
+        <w:t xml:space="preserve">1. </w:t>
+      </w:r>
+      <w:r>
+        <w:rPr>
+          <w:rFonts w:ascii="Malgun Gothic" w:hAnsi="Malgun Gothic" w:eastAsia="Malgun Gothic"/>
+          <w:b w:val="0"/>
+          <w:color w:val="334155"/>
+          <w:sz w:val="21"/>
+        </w:rPr>
+        <w:t xml:space="preserve">In the admin </w:t>
+      </w:r>
+      <w:r>
+        <w:rPr>
+          <w:rFonts w:ascii="Malgun Gothic" w:hAnsi="Malgun Gothic" w:eastAsia="Malgun Gothic"/>
+          <w:b/>
+          <w:color w:val="E11D48"/>
+          <w:sz w:val="21"/>
+        </w:rPr>
+        <w:t>Library</w:t>
+      </w:r>
+      <w:r>
+        <w:rPr>
+          <w:rFonts w:ascii="Malgun Gothic" w:hAnsi="Malgun Gothic" w:eastAsia="Malgun Gothic"/>
+          <w:b w:val="0"/>
+          <w:color w:val="334155"/>
+          <w:sz w:val="21"/>
+        </w:rPr>
+        <w:t xml:space="preserve">, press </w:t>
+      </w:r>
+      <w:r>
+        <w:rPr>
+          <w:rFonts w:ascii="Malgun Gothic" w:hAnsi="Malgun Gothic" w:eastAsia="Malgun Gothic"/>
+          <w:b/>
+          <w:color w:val="E11D48"/>
+          <w:sz w:val="21"/>
+        </w:rPr>
+        <w:t>💬 Copy KakaoTalk link</w:t>
+      </w:r>
+      <w:r>
+        <w:rPr>
+          <w:rFonts w:ascii="Malgun Gothic" w:hAnsi="Malgun Gothic" w:eastAsia="Malgun Gothic"/>
+          <w:b w:val="0"/>
+          <w:color w:val="334155"/>
+          <w:sz w:val="21"/>
+        </w:rPr>
+        <w:t xml:space="preserve"> next to the file.</w:t>
+      </w:r>
+    </w:p>
+    <w:p>
+      <w:pPr>
+        <w:spacing w:after="40"/>
+        <w:ind w:left="288"/>
+      </w:pPr>
+      <w:r>
+        <w:rPr>
+          <w:rFonts w:ascii="Malgun Gothic" w:hAnsi="Malgun Gothic" w:eastAsia="Malgun Gothic"/>
+          <w:b/>
+          <w:color w:val="F59E0B"/>
+          <w:sz w:val="21"/>
+        </w:rPr>
+        <w:t xml:space="preserve">2. </w:t>
+      </w:r>
+      <w:r>
+        <w:rPr>
+          <w:rFonts w:ascii="Malgun Gothic" w:hAnsi="Malgun Gothic" w:eastAsia="Malgun Gothic"/>
+          <w:b/>
+          <w:color w:val="E11D48"/>
+          <w:sz w:val="21"/>
+        </w:rPr>
+        <w:t>Paste</w:t>
+      </w:r>
+      <w:r>
+        <w:rPr>
+          <w:rFonts w:ascii="Malgun Gothic" w:hAnsi="Malgun Gothic" w:eastAsia="Malgun Gothic"/>
+          <w:b w:val="0"/>
+          <w:color w:val="334155"/>
+          <w:sz w:val="21"/>
+        </w:rPr>
+        <w:t xml:space="preserve"> it into the KakaoTalk chat room.</w:t>
+      </w:r>
+    </w:p>
+    <w:p>
+      <w:pPr>
+        <w:spacing w:after="40"/>
+        <w:ind w:left="288"/>
+      </w:pPr>
+      <w:r>
+        <w:rPr>
+          <w:rFonts w:ascii="Malgun Gothic" w:hAnsi="Malgun Gothic" w:eastAsia="Malgun Gothic"/>
+          <w:b/>
+          <w:color w:val="F59E0B"/>
+          <w:sz w:val="21"/>
+        </w:rPr>
+        <w:t xml:space="preserve">3. </w:t>
+      </w:r>
+      <w:r>
+        <w:rPr>
+          <w:rFonts w:ascii="Malgun Gothic" w:hAnsi="Malgun Gothic" w:eastAsia="Malgun Gothic"/>
+          <w:b w:val="0"/>
+          <w:color w:val="334155"/>
+          <w:sz w:val="21"/>
+        </w:rPr>
+        <w:t xml:space="preserve">Recipients tap the link to watch or download in </w:t>
+      </w:r>
+      <w:r>
+        <w:rPr>
+          <w:rFonts w:ascii="Malgun Gothic" w:hAnsi="Malgun Gothic" w:eastAsia="Malgun Gothic"/>
+          <w:b/>
+          <w:color w:val="E11D48"/>
+          <w:sz w:val="21"/>
+        </w:rPr>
+        <w:t>original quality</w:t>
+      </w:r>
+      <w:r>
+        <w:rPr>
+          <w:rFonts w:ascii="Malgun Gothic" w:hAnsi="Malgun Gothic" w:eastAsia="Malgun Gothic"/>
+          <w:b w:val="0"/>
+          <w:color w:val="334155"/>
+          <w:sz w:val="21"/>
+        </w:rPr>
+        <w:t>.</w:t>
+      </w:r>
+    </w:p>
+    <w:p>
+      <w:pPr>
+        <w:spacing w:after="40" w:before="80"/>
+      </w:pPr>
+      <w:r>
+        <w:rPr>
+          <w:rFonts w:ascii="Malgun Gothic" w:hAnsi="Malgun Gothic" w:eastAsia="Malgun Gothic"/>
+          <w:b/>
+          <w:color w:val="E11D48"/>
+          <w:sz w:val="21"/>
+        </w:rPr>
+        <w:t>✅ Key Points</w:t>
+      </w:r>
+    </w:p>
+    <w:p>
+      <w:pPr>
+        <w:spacing w:after="20"/>
+        <w:ind w:left="288"/>
+      </w:pPr>
+      <w:r>
+        <w:rPr>
+          <w:rFonts w:ascii="Malgun Gothic" w:hAnsi="Malgun Gothic"/>
+          <w:color w:val="E11D48"/>
+        </w:rPr>
+        <w:t xml:space="preserve">• </w:t>
+      </w:r>
+      <w:r>
+        <w:rPr>
+          <w:rFonts w:ascii="Malgun Gothic" w:hAnsi="Malgun Gothic" w:eastAsia="Malgun Gothic"/>
+          <w:b w:val="0"/>
+          <w:color w:val="334155"/>
+          <w:sz w:val="20"/>
+        </w:rPr>
+        <w:t xml:space="preserve">For videos, </w:t>
+      </w:r>
+      <w:r>
+        <w:rPr>
+          <w:rFonts w:ascii="Malgun Gothic" w:hAnsi="Malgun Gothic" w:eastAsia="Malgun Gothic"/>
+          <w:b/>
+          <w:color w:val="E11D48"/>
+          <w:sz w:val="20"/>
+        </w:rPr>
+        <w:t>link sharing = original quality</w:t>
+      </w:r>
+      <w:r>
+        <w:rPr>
+          <w:rFonts w:ascii="Malgun Gothic" w:hAnsi="Malgun Gothic" w:eastAsia="Malgun Gothic"/>
+          <w:b w:val="0"/>
+          <w:color w:val="334155"/>
+          <w:sz w:val="20"/>
+        </w:rPr>
+        <w:t>; file attachments degrade it.</w:t>
+      </w:r>
+    </w:p>
+    <w:p>
+      <w:pPr>
+        <w:spacing w:after="20"/>
+        <w:ind w:left="288"/>
+      </w:pPr>
+      <w:r>
+        <w:rPr>
+          <w:rFonts w:ascii="Malgun Gothic" w:hAnsi="Malgun Gothic"/>
+          <w:color w:val="E11D48"/>
+        </w:rPr>
+        <w:t xml:space="preserve">• </w:t>
+      </w:r>
+      <w:r>
+        <w:rPr>
+          <w:rFonts w:ascii="Malgun Gothic" w:hAnsi="Malgun Gothic" w:eastAsia="Malgun Gothic"/>
+          <w:b w:val="0"/>
+          <w:color w:val="334155"/>
+          <w:sz w:val="20"/>
+        </w:rPr>
+        <w:t>Works the same for PDFs, PPTs, and videos anywhere in the library.</w:t>
+      </w:r>
+    </w:p>
+    <w:tbl>
+      <w:tblPr>
+        <w:tblW w:type="auto" w:w="0"/>
+        <w:jc w:val="center"/>
+        <w:tblLook w:firstColumn="1" w:firstRow="1" w:lastColumn="0" w:lastRow="0" w:noHBand="0" w:noVBand="1" w:val="04A0"/>
+        <w:tblBorders>
+          <w:top w:val="none"/>
+          <w:left w:val="none"/>
+          <w:bottom w:val="none"/>
+          <w:right w:val="none"/>
+          <w:insideH w:val="none"/>
+          <w:insideV w:val="none"/>
+        </w:tblBorders>
+      </w:tblPr>
+      <w:tblGrid>
+        <w:gridCol w:w="9936"/>
+      </w:tblGrid>
+      <w:tr>
+        <w:tc>
+          <w:tcPr>
+            <w:tcW w:type="dxa" w:w="9216"/>
+            <w:shd w:val="clear" w:fill="FFFBEB"/>
+          </w:tcPr>
+          <w:p>
+            <w:pPr>
+              <w:spacing w:after="40" w:before="40"/>
+            </w:pPr>
+            <w:r>
+              <w:rPr>
+                <w:rFonts w:ascii="Malgun Gothic" w:hAnsi="Malgun Gothic" w:eastAsia="Malgun Gothic"/>
+                <w:b/>
+                <w:color w:val="B45309"/>
+                <w:sz w:val="21"/>
+              </w:rPr>
+              <w:t xml:space="preserve">⚠️ Good to know </w:t>
+            </w:r>
+            <w:r>
+              <w:rPr>
+                <w:rFonts w:ascii="Malgun Gothic" w:hAnsi="Malgun Gothic" w:eastAsia="Malgun Gothic"/>
+                <w:b w:val="0"/>
+                <w:color w:val="92670A"/>
+                <w:sz w:val="20"/>
+              </w:rPr>
+              <w:t>Anyone with the link can open it. For internal-only material, check who you share with.</w:t>
+            </w:r>
+          </w:p>
+        </w:tc>
+      </w:tr>
+    </w:tbl>
+    <w:p>
+      <w:pPr>
+        <w:spacing w:after="40"/>
+      </w:pPr>
+    </w:p>
+    <w:tbl>
+      <w:tblPr>
+        <w:tblW w:type="auto" w:w="0"/>
+        <w:jc w:val="center"/>
+        <w:tblLook w:firstColumn="1" w:firstRow="1" w:lastColumn="0" w:lastRow="0" w:noHBand="0" w:noVBand="1" w:val="04A0"/>
+        <w:tblBorders>
+          <w:top w:val="none"/>
+          <w:left w:val="none"/>
+          <w:bottom w:val="none"/>
+          <w:right w:val="none"/>
+          <w:insideH w:val="none"/>
+          <w:insideV w:val="none"/>
+        </w:tblBorders>
+      </w:tblPr>
+      <w:tblGrid>
+        <w:gridCol w:w="9936"/>
+      </w:tblGrid>
+      <w:tr>
+        <w:tc>
+          <w:tcPr>
+            <w:tcW w:type="dxa" w:w="9216"/>
+            <w:shd w:val="clear" w:fill="FFF7E6"/>
+          </w:tcPr>
+          <w:p>
+            <w:pPr>
+              <w:spacing w:after="40" w:before="40"/>
+            </w:pPr>
+            <w:r>
+              <w:rPr>
+                <w:rFonts w:ascii="Malgun Gothic" w:hAnsi="Malgun Gothic" w:eastAsia="Malgun Gothic"/>
+                <w:b/>
+                <w:color w:val="E8630A"/>
+                <w:sz w:val="21"/>
+              </w:rPr>
+              <w:t xml:space="preserve">💡 Tip </w:t>
+            </w:r>
+            <w:r>
+              <w:rPr>
+                <w:rFonts w:ascii="Malgun Gothic" w:hAnsi="Malgun Gothic" w:eastAsia="Malgun Gothic"/>
+                <w:b w:val="0"/>
+                <w:color w:val="5B4A2A"/>
+                <w:sz w:val="20"/>
+              </w:rPr>
+              <w:t>In a parents' group chat, one video-guide link does all the explaining.</w:t>
+            </w:r>
+          </w:p>
+        </w:tc>
+      </w:tr>
+    </w:tbl>
+    <w:p>
+      <w:pPr>
+        <w:spacing w:after="40"/>
+      </w:pPr>
+    </w:p>
+    <w:p>
+      <w:pPr>
+        <w:spacing w:before="80" w:after="160"/>
+        <w:jc w:val="center"/>
+      </w:pPr>
+      <w:r>
+        <w:drawing>
+          <wp:inline xmlns:a="http://schemas.openxmlformats.org/drawingml/2006/main" xmlns:pic="http://schemas.openxmlformats.org/drawingml/2006/picture">
+            <wp:extent cx="5669280" cy="3543300"/>
+            <wp:docPr id="21" name="Picture 21"/>
+            <wp:cNvGraphicFramePr>
+              <a:graphicFrameLocks noChangeAspect="1"/>
+            </wp:cNvGraphicFramePr>
+            <a:graphic>
+              <a:graphicData uri="http://schemas.openxmlformats.org/drawingml/2006/picture">
+                <pic:pic>
+                  <pic:nvPicPr>
+                    <pic:cNvPr id="0" name="admin_noticestudio.jpg"/>
+                    <pic:cNvPicPr/>
+                  </pic:nvPicPr>
+                  <pic:blipFill>
+                    <a:blip r:embed="rId22"/>
                     <a:stretch>
                       <a:fillRect/>
                     </a:stretch>

</xml_diff>